<commit_message>
finalise pipeline — updated README, report, and all outputs
</commit_message>
<xml_diff>
--- a/outputs/report.docx
+++ b/outputs/report.docx
@@ -31,7 +31,7 @@
         <w:pStyle w:val="Date"/>
       </w:pPr>
       <w:r>
-        <w:t xml:space="preserve">2026-04-30</w:t>
+        <w:t xml:space="preserve">2026-05-06</w:t>
       </w:r>
     </w:p>
     <w:sdt>
@@ -670,43 +670,19 @@
         <w:pStyle w:val="FirstParagraph"/>
       </w:pPr>
       <w:r>
-        <w:t xml:space="preserve">No full-row duplicates were found. 1,523 records share the same</w:t>
-      </w:r>
-      <w:r>
-        <w:t xml:space="preserve"> </w:t>
-      </w:r>
-      <w:r>
-        <w:rPr>
-          <w:rStyle w:val="VerbatimChar"/>
-        </w:rPr>
-        <w:t xml:space="preserve">name</w:t>
-      </w:r>
-      <w:r>
-        <w:t xml:space="preserve"> </w:t>
-      </w:r>
-      <w:r>
-        <w:t xml:space="preserve">and</w:t>
-      </w:r>
-      <w:r>
-        <w:t xml:space="preserve"> </w:t>
-      </w:r>
-      <w:r>
-        <w:rPr>
-          <w:rStyle w:val="VerbatimChar"/>
-        </w:rPr>
-        <w:t xml:space="preserve">author</w:t>
-      </w:r>
-      <w:r>
-        <w:t xml:space="preserve"> </w:t>
-      </w:r>
-      <w:r>
-        <w:t xml:space="preserve">but differ by narrator, language, release date, or price and confirmed as distinct</w:t>
-      </w:r>
-      <w:r>
-        <w:t xml:space="preserve"> </w:t>
-      </w:r>
-      <w:r>
-        <w:t xml:space="preserve">editions. No deduplication was applied.</w:t>
+        <w:t xml:space="preserve">No full-row duplicates were found. 1,523 records share the same name and author</w:t>
+      </w:r>
+      <w:r>
+        <w:t xml:space="preserve"> </w:t>
+      </w:r>
+      <w:r>
+        <w:t xml:space="preserve">but differ by narrator, language, release date, or price. These were confirmed</w:t>
+      </w:r>
+      <w:r>
+        <w:t xml:space="preserve"> </w:t>
+      </w:r>
+      <w:r>
+        <w:t xml:space="preserve">as distinct editions and no deduplication was applied.</w:t>
       </w:r>
     </w:p>
     <w:bookmarkEnd w:id="16"/>
@@ -1076,19 +1052,19 @@
         <w:t xml:space="preserve"> </w:t>
       </w:r>
       <w:r>
-        <w:t xml:space="preserve">for both columns. This is a structural missing error,</w:t>
-      </w:r>
-      <w:r>
-        <w:t xml:space="preserve"> </w:t>
-      </w:r>
-      <w:r>
-        <w:t xml:space="preserve">83% of the dataset is unrated, reflecting genuine absence of ratings rather than</w:t>
-      </w:r>
-      <w:r>
-        <w:t xml:space="preserve"> </w:t>
-      </w:r>
-      <w:r>
-        <w:t xml:space="preserve">a data collection failure.</w:t>
+        <w:t xml:space="preserve">for both columns. This is structural missing. 83%</w:t>
+      </w:r>
+      <w:r>
+        <w:t xml:space="preserve"> </w:t>
+      </w:r>
+      <w:r>
+        <w:t xml:space="preserve">of the dataset is unrated, reflecting genuine absence of ratings rather than a</w:t>
+      </w:r>
+      <w:r>
+        <w:t xml:space="preserve"> </w:t>
+      </w:r>
+      <w:r>
+        <w:t xml:space="preserve">data collection failure.</w:t>
       </w:r>
     </w:p>
     <w:bookmarkEnd w:id="21"/>

</xml_diff>

<commit_message>
minor fixes imputation, labels, charts, report updated
</commit_message>
<xml_diff>
--- a/outputs/report.docx
+++ b/outputs/report.docx
@@ -31,7 +31,7 @@
         <w:pStyle w:val="Date"/>
       </w:pPr>
       <w:r>
-        <w:t xml:space="preserve">2026-05-06</w:t>
+        <w:t xml:space="preserve">2026-05-11</w:t>
       </w:r>
     </w:p>
     <w:sdt>
@@ -74,19 +74,7 @@
         <w:pStyle w:val="FirstParagraph"/>
       </w:pPr>
       <w:r>
-        <w:t xml:space="preserve">The dataset used in this pipeline is the Audible audiobook dataset sourced from Kaggle</w:t>
-      </w:r>
-      <w:r>
-        <w:t xml:space="preserve"> </w:t>
-      </w:r>
-      <w:r>
-        <w:t xml:space="preserve">(CC0 Public Domain, collected by Snehangsude via web scraping from Audible.in).</w:t>
-      </w:r>
-      <w:r>
-        <w:t xml:space="preserve"> </w:t>
-      </w:r>
-      <w:r>
-        <w:t xml:space="preserve">It contains</w:t>
+        <w:t xml:space="preserve">The dataset used in this pipeline is the Audible audiobook dataset sourced from Kaggle (CC0 Public Domain, collected by Snehangsude via web scraping from Audible.in). It contains</w:t>
       </w:r>
       <w:r>
         <w:t xml:space="preserve"> </w:t>
@@ -118,19 +106,7 @@
         <w:t xml:space="preserve"> </w:t>
       </w:r>
       <w:r>
-        <w:t xml:space="preserve">covering audiobook titles,</w:t>
-      </w:r>
-      <w:r>
-        <w:t xml:space="preserve"> </w:t>
-      </w:r>
-      <w:r>
-        <w:t xml:space="preserve">authors, narrators, duration, release dates, languages, star ratings, and prices in INR.</w:t>
-      </w:r>
-      <w:r>
-        <w:t xml:space="preserve"> </w:t>
-      </w:r>
-      <w:r>
-        <w:t xml:space="preserve">The data spans releases from December 1998 through November 2025.</w:t>
+        <w:t xml:space="preserve">covering audiobook titles, authors, narrators, duration, release dates, languages, star ratings, and prices in INR. The data spans releases from December 1998 through November 2025.</w:t>
       </w:r>
     </w:p>
     <w:tbl>
@@ -564,7 +540,7 @@
               <w:pStyle w:val="ImageCaption"/>
             </w:pPr>
             <w:r>
-              <w:t xml:space="preserve">Figure 1: Missingness by variable, placeholders recoded to NA for visualisation</w:t>
+              <w:t xml:space="preserve">Figure 1: Missingness by variable, before and after cleaning</w:t>
             </w:r>
           </w:p>
           <w:bookmarkEnd w:id="13"/>
@@ -586,13 +562,7 @@
         <w:pStyle w:val="FirstParagraph"/>
       </w:pPr>
       <w:r>
-        <w:t xml:space="preserve">All eight raw variables were ingested as character strings. Type coercion was required</w:t>
-      </w:r>
-      <w:r>
-        <w:t xml:space="preserve"> </w:t>
-      </w:r>
-      <w:r>
-        <w:t xml:space="preserve">for</w:t>
+        <w:t xml:space="preserve">All eight raw variables were ingested as character strings. Type coercion was required for</w:t>
       </w:r>
       <w:r>
         <w:t xml:space="preserve"> </w:t>
@@ -670,19 +640,7 @@
         <w:pStyle w:val="FirstParagraph"/>
       </w:pPr>
       <w:r>
-        <w:t xml:space="preserve">No full-row duplicates were found. 1,523 records share the same name and author</w:t>
-      </w:r>
-      <w:r>
-        <w:t xml:space="preserve"> </w:t>
-      </w:r>
-      <w:r>
-        <w:t xml:space="preserve">but differ by narrator, language, release date, or price. These were confirmed</w:t>
-      </w:r>
-      <w:r>
-        <w:t xml:space="preserve"> </w:t>
-      </w:r>
-      <w:r>
-        <w:t xml:space="preserve">as distinct editions and no deduplication was applied.</w:t>
+        <w:t xml:space="preserve">No full-row duplicates were found. 1,523 records share the same name and author but differ by narrator, language, release date, or price. These were confirmed as distinct editions and no deduplication was applied.</w:t>
       </w:r>
     </w:p>
     <w:bookmarkEnd w:id="16"/>
@@ -731,13 +689,7 @@
         <w:t xml:space="preserve">Narratedby:</w:t>
       </w:r>
       <w:r>
-        <w:t xml:space="preserve">) with no</w:t>
-      </w:r>
-      <w:r>
-        <w:t xml:space="preserve"> </w:t>
-      </w:r>
-      <w:r>
-        <w:t xml:space="preserve">spaces between words (e.g. </w:t>
+        <w:t xml:space="preserve">) with no spaces between words (e.g. </w:t>
       </w:r>
       <w:r>
         <w:rPr>
@@ -746,25 +698,7 @@
         <w:t xml:space="preserve">GeronimoStilton</w:t>
       </w:r>
       <w:r>
-        <w:t xml:space="preserve">). The prefix was stripped using regex</w:t>
-      </w:r>
-      <w:r>
-        <w:t xml:space="preserve"> </w:t>
-      </w:r>
-      <w:r>
-        <w:t xml:space="preserve">and word boundaries were inserted between camelCase joins. This was verified to work</w:t>
-      </w:r>
-      <w:r>
-        <w:t xml:space="preserve"> </w:t>
-      </w:r>
-      <w:r>
-        <w:t xml:space="preserve">correctly on Latin, accented, and Asian-script names. A known edge case exists where</w:t>
-      </w:r>
-      <w:r>
-        <w:t xml:space="preserve"> </w:t>
-      </w:r>
-      <w:r>
-        <w:t xml:space="preserve">compound lowercase particles (e.g. </w:t>
+        <w:t xml:space="preserve">). The prefix was stripped using regex and word boundaries were inserted between camelCase joins. This was verified to work correctly on Latin, accented, and Asian-script names. A known edge case exists where compound lowercase particles (e.g. </w:t>
       </w:r>
       <w:r>
         <w:rPr>
@@ -785,13 +719,7 @@
         <w:t xml:space="preserve">van</w:t>
       </w:r>
       <w:r>
-        <w:t xml:space="preserve">) following an initial may not be</w:t>
-      </w:r>
-      <w:r>
-        <w:t xml:space="preserve"> </w:t>
-      </w:r>
-      <w:r>
-        <w:t xml:space="preserve">separated but it was documented as a limitation.</w:t>
+        <w:t xml:space="preserve">) following an initial may not be separated but it was documented as a limitation.</w:t>
       </w:r>
     </w:p>
     <w:bookmarkEnd w:id="18"/>
@@ -809,13 +737,7 @@
         <w:pStyle w:val="FirstParagraph"/>
       </w:pPr>
       <w:r>
-        <w:t xml:space="preserve">All language values were normalised to title case and underscores replaced with spaces</w:t>
-      </w:r>
-      <w:r>
-        <w:t xml:space="preserve"> </w:t>
-      </w:r>
-      <w:r>
-        <w:t xml:space="preserve">(</w:t>
+        <w:t xml:space="preserve">All language values were normalised to title case and underscores replaced with spaces (</w:t>
       </w:r>
       <w:r>
         <w:rPr>
@@ -869,13 +791,7 @@
         <w:t xml:space="preserve"> </w:t>
       </w:r>
       <w:r>
-        <w:t xml:space="preserve">were already</w:t>
-      </w:r>
-      <w:r>
-        <w:t xml:space="preserve"> </w:t>
-      </w:r>
-      <w:r>
-        <w:t xml:space="preserve">title case; all other 34 languages were lowercase.</w:t>
+        <w:t xml:space="preserve">were already title case; all other 34 languages were lowercase.</w:t>
       </w:r>
     </w:p>
     <w:bookmarkEnd w:id="19"/>
@@ -920,13 +836,7 @@
         <w:t xml:space="preserve"> </w:t>
       </w:r>
       <w:r>
-        <w:t xml:space="preserve">entries</w:t>
-      </w:r>
-      <w:r>
-        <w:t xml:space="preserve"> </w:t>
-      </w:r>
-      <w:r>
-        <w:t xml:space="preserve">were converted to</w:t>
+        <w:t xml:space="preserve">entries were converted to</w:t>
       </w:r>
       <w:r>
         <w:t xml:space="preserve"> </w:t>
@@ -953,13 +863,7 @@
         <w:t xml:space="preserve">NA</w:t>
       </w:r>
       <w:r>
-        <w:t xml:space="preserve">, free audiobooks are a legitimate price point,</w:t>
-      </w:r>
-      <w:r>
-        <w:t xml:space="preserve"> </w:t>
-      </w:r>
-      <w:r>
-        <w:t xml:space="preserve">not missing data. Converted to numeric.</w:t>
+        <w:t xml:space="preserve">, free audiobooks are a legitimate price point, not missing data. Converted to numeric.</w:t>
       </w:r>
     </w:p>
     <w:bookmarkEnd w:id="20"/>
@@ -1052,19 +956,7 @@
         <w:t xml:space="preserve"> </w:t>
       </w:r>
       <w:r>
-        <w:t xml:space="preserve">for both columns. This is structural missing. 83%</w:t>
-      </w:r>
-      <w:r>
-        <w:t xml:space="preserve"> </w:t>
-      </w:r>
-      <w:r>
-        <w:t xml:space="preserve">of the dataset is unrated, reflecting genuine absence of ratings rather than a</w:t>
-      </w:r>
-      <w:r>
-        <w:t xml:space="preserve"> </w:t>
-      </w:r>
-      <w:r>
-        <w:t xml:space="preserve">data collection failure.</w:t>
+        <w:t xml:space="preserve">for both columns. This is structural missing. 83% of the dataset is unrated, reflecting genuine absence of ratings rather than a data collection failure.</w:t>
       </w:r>
     </w:p>
     <w:bookmarkEnd w:id="21"/>
@@ -1097,13 +989,7 @@
         <w:t xml:space="preserve"> </w:t>
       </w:r>
       <w:r>
-        <w:t xml:space="preserve">(total minutes, numeric). All</w:t>
-      </w:r>
-      <w:r>
-        <w:t xml:space="preserve"> </w:t>
-      </w:r>
-      <w:r>
-        <w:t xml:space="preserve">format variants were handled:</w:t>
+        <w:t xml:space="preserve">(total minutes, numeric). All format variants were handled:</w:t>
       </w:r>
       <w:r>
         <w:t xml:space="preserve"> </w:t>
@@ -1199,19 +1085,7 @@
         <w:t xml:space="preserve"> </w:t>
       </w:r>
       <w:r>
-        <w:t xml:space="preserve">were parsed to proper R date objects. A century cutoff</w:t>
-      </w:r>
-      <w:r>
-        <w:t xml:space="preserve"> </w:t>
-      </w:r>
-      <w:r>
-        <w:t xml:space="preserve">rule was applied: 2-digit years 95–99 map to 1995–1999; 00–94 map to 2000–2094.</w:t>
-      </w:r>
-      <w:r>
-        <w:t xml:space="preserve"> </w:t>
-      </w:r>
-      <w:r>
-        <w:t xml:space="preserve">This is justified by the dataset’s documented range of 1998–2025. No NAs were</w:t>
+        <w:t xml:space="preserve">were parsed to proper R date objects. A century cutoff rule was applied: 2-digit years 95–99 map to 1995–1999; 00–94 map to 2000–2094. This is justified by the dataset’s documented range of 1998–2025. No NAs were</w:t>
       </w:r>
       <w:r>
         <w:t xml:space="preserve"> </w:t>
@@ -1247,19 +1121,7 @@
         <w:t xml:space="preserve">short_name_flag</w:t>
       </w:r>
       <w:r>
-        <w:t xml:space="preserve">.</w:t>
-      </w:r>
-      <w:r>
-        <w:t xml:space="preserve"> </w:t>
-      </w:r>
-      <w:r>
-        <w:t xml:space="preserve">These are likely legitimate titles (single characters, numbers, Japanese kanji) and</w:t>
-      </w:r>
-      <w:r>
-        <w:t xml:space="preserve"> </w:t>
-      </w:r>
-      <w:r>
-        <w:t xml:space="preserve">were not removed.</w:t>
+        <w:t xml:space="preserve">. These are likely legitimate titles (single characters, numbers, Japanese kanji) and were not removed.</w:t>
       </w:r>
     </w:p>
     <w:bookmarkEnd w:id="24"/>
@@ -1304,19 +1166,7 @@
         <w:t xml:space="preserve">duration_mins</w:t>
       </w:r>
       <w:r>
-        <w:t xml:space="preserve">.</w:t>
-      </w:r>
-      <w:r>
-        <w:t xml:space="preserve"> </w:t>
-      </w:r>
-      <w:r>
-        <w:t xml:space="preserve">704 price outliers and 2,098 duration outliers were flagged. No records were dropped, but</w:t>
-      </w:r>
-      <w:r>
-        <w:t xml:space="preserve"> </w:t>
-      </w:r>
-      <w:r>
-        <w:t xml:space="preserve">flags are available for downstream analysis.</w:t>
+        <w:t xml:space="preserve">. 704 price outliers and 2,098 duration outliers were flagged. No records were dropped, but flags are available for downstream analysis.</w:t>
       </w:r>
     </w:p>
     <w:bookmarkEnd w:id="25"/>
@@ -1365,31 +1215,7 @@
         <w:t xml:space="preserve"> </w:t>
       </w:r>
       <w:r>
-        <w:t xml:space="preserve">contained missing values after cleaning (72,417 NAs,</w:t>
-      </w:r>
-      <w:r>
-        <w:t xml:space="preserve"> </w:t>
-      </w:r>
-      <w:r>
-        <w:t xml:space="preserve">82.8%). Imputation was not applied. With 83% of the column missing, any imputed value</w:t>
-      </w:r>
-      <w:r>
-        <w:t xml:space="preserve"> </w:t>
-      </w:r>
-      <w:r>
-        <w:t xml:space="preserve">would reflect the distribution of the rated minority, not the true population. The</w:t>
-      </w:r>
-      <w:r>
-        <w:t xml:space="preserve"> </w:t>
-      </w:r>
-      <w:r>
-        <w:t xml:space="preserve">missingness is structural, books without ratings on Audible simply have no rating.</w:t>
-      </w:r>
-      <w:r>
-        <w:t xml:space="preserve"> </w:t>
-      </w:r>
-      <w:r>
-        <w:t xml:space="preserve">Leaving these as</w:t>
+        <w:t xml:space="preserve">contained missing values after cleaning (72,417 NAs, 82.8%). Imputation was not applied. With 83% of the column missing, any imputed value would reflect the distribution of the rated minority, not the true population. The missingness is structural, books without ratings on Audible simply have no rating. Leaving these as</w:t>
       </w:r>
       <w:r>
         <w:t xml:space="preserve"> </w:t>
@@ -1412,11 +1238,11 @@
         <w:pStyle w:val="BodyText"/>
       </w:pPr>
       <w:r>
-        <w:t xml:space="preserve">All other variables had zero missing values after cleaning.</w:t>
+        <w:t xml:space="preserve">All other variables had zero missing values after cleaning. Price was imputed for the 338 Free entries using the median non-zero price (INR 585).</w:t>
       </w:r>
     </w:p>
     <w:bookmarkEnd w:id="27"/>
-    <w:bookmarkStart w:id="45" w:name="post-cleaning-summary"/>
+    <w:bookmarkStart w:id="48" w:name="post-cleaning-summary"/>
     <w:p>
       <w:pPr>
         <w:pStyle w:val="Heading1"/>
@@ -1544,7 +1370,7 @@
                     <w:jc w:val="center"/>
                   </w:pPr>
                   <w:r>
-                    <w:t xml:space="preserve">14</w:t>
+                    <w:t xml:space="preserve">16</w:t>
                   </w:r>
                 </w:p>
               </w:tc>
@@ -1881,6 +1707,61 @@
         </w:tc>
       </w:tr>
     </w:tbl>
+    <w:p>
+      <w:pPr>
+        <w:pStyle w:val="CaptionedFigure"/>
+      </w:pPr>
+      <w:r>
+        <w:drawing>
+          <wp:inline>
+            <wp:extent cx="5334000" cy="3048000"/>
+            <wp:effectExtent b="0" l="0" r="0" t="0"/>
+            <wp:docPr descr="Observed vs imputed price values — Free entries imputed with median" title="" id="38" name="Picture"/>
+            <a:graphic>
+              <a:graphicData uri="http://schemas.openxmlformats.org/drawingml/2006/picture">
+                <pic:pic>
+                  <pic:nvPicPr>
+                    <pic:cNvPr descr="06_report_files/figure-docx/unnamed-chunk-1-1.png" id="39" name="Picture"/>
+                    <pic:cNvPicPr>
+                      <a:picLocks noChangeArrowheads="1" noChangeAspect="1"/>
+                    </pic:cNvPicPr>
+                  </pic:nvPicPr>
+                  <pic:blipFill>
+                    <a:blip r:embed="rId37"/>
+                    <a:stretch>
+                      <a:fillRect/>
+                    </a:stretch>
+                  </pic:blipFill>
+                  <pic:spPr bwMode="auto">
+                    <a:xfrm>
+                      <a:off x="0" y="0"/>
+                      <a:ext cx="5334000" cy="3048000"/>
+                    </a:xfrm>
+                    <a:prstGeom prst="rect">
+                      <a:avLst/>
+                    </a:prstGeom>
+                    <a:noFill/>
+                    <a:ln w="9525">
+                      <a:noFill/>
+                      <a:headEnd/>
+                      <a:tailEnd/>
+                    </a:ln>
+                  </pic:spPr>
+                </pic:pic>
+              </a:graphicData>
+            </a:graphic>
+          </wp:inline>
+        </w:drawing>
+      </w:r>
+    </w:p>
+    <w:p>
+      <w:pPr>
+        <w:pStyle w:val="ImageCaption"/>
+      </w:pPr>
+      <w:r>
+        <w:t xml:space="preserve">Observed vs imputed price values — Free entries imputed with median</w:t>
+      </w:r>
+    </w:p>
     <w:tbl>
       <w:tblPr>
         <w:tblStyle w:val="Table"/>
@@ -1894,7 +1775,7 @@
       <w:tr>
         <w:tc>
           <w:tcPr/>
-          <w:bookmarkStart w:id="40" w:name="fig-rating"/>
+          <w:bookmarkStart w:id="43" w:name="fig-rating"/>
           <w:p>
             <w:pPr>
               <w:pStyle w:val="Compact"/>
@@ -1905,18 +1786,18 @@
                 <wp:inline>
                   <wp:extent cx="5334000" cy="3048000"/>
                   <wp:effectExtent b="0" l="0" r="0" t="0"/>
-                  <wp:docPr descr="" title="" id="38" name="Picture"/>
+                  <wp:docPr descr="" title="" id="41" name="Picture"/>
                   <a:graphic>
                     <a:graphicData uri="http://schemas.openxmlformats.org/drawingml/2006/picture">
                       <pic:pic>
                         <pic:nvPicPr>
-                          <pic:cNvPr descr="06_report_files/figure-docx/fig-rating-1.png" id="39" name="Picture"/>
+                          <pic:cNvPr descr="06_report_files/figure-docx/fig-rating-1.png" id="42" name="Picture"/>
                           <pic:cNvPicPr>
                             <a:picLocks noChangeArrowheads="1" noChangeAspect="1"/>
                           </pic:cNvPicPr>
                         </pic:nvPicPr>
                         <pic:blipFill>
-                          <a:blip r:embed="rId37"/>
+                          <a:blip r:embed="rId40"/>
                           <a:stretch>
                             <a:fillRect/>
                           </a:stretch>
@@ -1956,7 +1837,7 @@
               <w:t xml:space="preserve">Figure 4: Distribution of star ratings among rated audiobooks</w:t>
             </w:r>
           </w:p>
-          <w:bookmarkEnd w:id="40"/>
+          <w:bookmarkEnd w:id="43"/>
         </w:tc>
       </w:tr>
     </w:tbl>
@@ -1973,7 +1854,7 @@
       <w:tr>
         <w:tc>
           <w:tcPr/>
-          <w:bookmarkStart w:id="44" w:name="fig-language"/>
+          <w:bookmarkStart w:id="47" w:name="fig-language"/>
           <w:p>
             <w:pPr>
               <w:pStyle w:val="Compact"/>
@@ -1984,18 +1865,18 @@
                 <wp:inline>
                   <wp:extent cx="5334000" cy="3048000"/>
                   <wp:effectExtent b="0" l="0" r="0" t="0"/>
-                  <wp:docPr descr="" title="" id="42" name="Picture"/>
+                  <wp:docPr descr="" title="" id="45" name="Picture"/>
                   <a:graphic>
                     <a:graphicData uri="http://schemas.openxmlformats.org/drawingml/2006/picture">
                       <pic:pic>
                         <pic:nvPicPr>
-                          <pic:cNvPr descr="06_report_files/figure-docx/fig-language-1.png" id="43" name="Picture"/>
+                          <pic:cNvPr descr="06_report_files/figure-docx/fig-language-1.png" id="46" name="Picture"/>
                           <pic:cNvPicPr>
                             <a:picLocks noChangeArrowheads="1" noChangeAspect="1"/>
                           </pic:cNvPicPr>
                         </pic:nvPicPr>
                         <pic:blipFill>
-                          <a:blip r:embed="rId41"/>
+                          <a:blip r:embed="rId44"/>
                           <a:stretch>
                             <a:fillRect/>
                           </a:stretch>
@@ -2035,12 +1916,12 @@
               <w:t xml:space="preserve">Figure 5: Top 10 languages by number of audiobooks</w:t>
             </w:r>
           </w:p>
-          <w:bookmarkEnd w:id="44"/>
+          <w:bookmarkEnd w:id="47"/>
         </w:tc>
       </w:tr>
     </w:tbl>
-    <w:bookmarkEnd w:id="45"/>
-    <w:bookmarkStart w:id="46" w:name="limitations-and-known-risks"/>
+    <w:bookmarkEnd w:id="48"/>
+    <w:bookmarkStart w:id="49" w:name="limitations-and-known-risks"/>
     <w:p>
       <w:pPr>
         <w:pStyle w:val="Heading1"/>
@@ -2067,13 +1948,7 @@
         <w:t xml:space="preserve"> </w:t>
       </w:r>
       <w:r>
-        <w:t xml:space="preserve">- the regex correctly handles standard camelCase</w:t>
-      </w:r>
-      <w:r>
-        <w:t xml:space="preserve"> </w:t>
-      </w:r>
-      <w:r>
-        <w:t xml:space="preserve">but may miss spaces before lowercase particles (e.g. </w:t>
+        <w:t xml:space="preserve">- the regex correctly handles standard camelCase but may miss spaces before lowercase particles (e.g. </w:t>
       </w:r>
       <w:r>
         <w:rPr>
@@ -2106,13 +1981,7 @@
         <w:t xml:space="preserve">al</w:t>
       </w:r>
       <w:r>
-        <w:t xml:space="preserve">) in</w:t>
-      </w:r>
-      <w:r>
-        <w:t xml:space="preserve"> </w:t>
-      </w:r>
-      <w:r>
-        <w:t xml:space="preserve">non-English names. Affected records are a small minority and have been noted.</w:t>
+        <w:t xml:space="preserve">) in non-English names. Affected records are a small minority and have been noted.</w:t>
       </w:r>
     </w:p>
     <w:p>
@@ -2133,19 +2002,7 @@
         <w:t xml:space="preserve"> </w:t>
       </w:r>
       <w:r>
-        <w:t xml:space="preserve">- the century cutoff rule is a judgment call. Any record</w:t>
-      </w:r>
-      <w:r>
-        <w:t xml:space="preserve"> </w:t>
-      </w:r>
-      <w:r>
-        <w:t xml:space="preserve">with a release year of 95–99 has been mapped to the 1990s. If future data contains</w:t>
-      </w:r>
-      <w:r>
-        <w:t xml:space="preserve"> </w:t>
-      </w:r>
-      <w:r>
-        <w:t xml:space="preserve">genuine 2095–2099 releases, this rule would need revisiting.</w:t>
+        <w:t xml:space="preserve">- the century cutoff rule is a judgment call. Any record with a release year of 95–99 has been mapped to the 1990s. If future data contains genuine 2095–2099 releases, this rule would need revisiting.</w:t>
       </w:r>
     </w:p>
     <w:p>
@@ -2166,13 +2023,7 @@
         <w:t xml:space="preserve"> </w:t>
       </w:r>
       <w:r>
-        <w:t xml:space="preserve">- all prices are in Indian Rupees (INR), as this data was</w:t>
-      </w:r>
-      <w:r>
-        <w:t xml:space="preserve"> </w:t>
-      </w:r>
-      <w:r>
-        <w:t xml:space="preserve">scraped from Audible.in. No currency conversion has been applied.</w:t>
+        <w:t xml:space="preserve">- all prices are in Indian Rupees (INR), as this data was scraped from Audible.in. No currency conversion has been applied.</w:t>
       </w:r>
     </w:p>
     <w:p>
@@ -2205,13 +2056,7 @@
         <w:t xml:space="preserve">NA</w:t>
       </w:r>
       <w:r>
-        <w:t xml:space="preserve">. Any analysis</w:t>
-      </w:r>
-      <w:r>
-        <w:t xml:space="preserve"> </w:t>
-      </w:r>
-      <w:r>
-        <w:t xml:space="preserve">using</w:t>
+        <w:t xml:space="preserve">. Any analysis using</w:t>
       </w:r>
       <w:r>
         <w:t xml:space="preserve"> </w:t>
@@ -2241,13 +2086,7 @@
         <w:t xml:space="preserve"> </w:t>
       </w:r>
       <w:r>
-        <w:t xml:space="preserve">applies only to the 17.2% of audiobooks that</w:t>
-      </w:r>
-      <w:r>
-        <w:t xml:space="preserve"> </w:t>
-      </w:r>
-      <w:r>
-        <w:t xml:space="preserve">have been rated, and may not be representative of the full catalogue.</w:t>
+        <w:t xml:space="preserve">applies only to the 17.2% of audiobooks that have been rated, and may not be representative of the full catalogue.</w:t>
       </w:r>
     </w:p>
     <w:p>
@@ -2268,22 +2107,10 @@
         <w:t xml:space="preserve"> </w:t>
       </w:r>
       <w:r>
-        <w:t xml:space="preserve">- the dataset was collected via scraping and may contain</w:t>
-      </w:r>
-      <w:r>
-        <w:t xml:space="preserve"> </w:t>
-      </w:r>
-      <w:r>
-        <w:t xml:space="preserve">transcription errors, encoding artefacts, or records that were incomplete at the</w:t>
-      </w:r>
-      <w:r>
-        <w:t xml:space="preserve"> </w:t>
-      </w:r>
-      <w:r>
-        <w:t xml:space="preserve">time of collection.</w:t>
-      </w:r>
-    </w:p>
-    <w:bookmarkEnd w:id="46"/>
+        <w:t xml:space="preserve">- the dataset was collected via scraping and may contain transcription errors, encoding artefacts, or records that were incomplete at the time of collection.</w:t>
+      </w:r>
+    </w:p>
+    <w:bookmarkEnd w:id="49"/>
     <w:sectPr>
       <w:footnotePr>
         <w:numRestart w:val="eachSect"/>

</xml_diff>